<commit_message>
add multimodal rag pipeline
</commit_message>
<xml_diff>
--- a/最新版rag套件流程.docx
+++ b/最新版rag套件流程.docx
@@ -1859,11 +1859,6 @@
     </w:p>
     <w:p/>
     <w:p>
-      <w:pPr>
-        <w:rPr>
-          <w:rFonts w:hint="eastAsia"/>
-        </w:rPr>
-      </w:pPr>
       <w:r>
         <w:t>python query_with_ollama_new.py --</w:t>
       </w:r>
@@ -1979,6 +1974,38 @@
     </w:p>
     <w:p/>
     <w:p/>
+    <w:p>
+      <w:r>
+        <w:lastRenderedPageBreak/>
+        <w:t>git add query_with_ollama_new.py</w:t>
+      </w:r>
+    </w:p>
+    <w:p>
+      <w:r>
+        <w:t xml:space="preserve">git commit -m "add </w:t>
+      </w:r>
+      <w:proofErr w:type="spellStart"/>
+      <w:r>
+        <w:t>fastapi</w:t>
+      </w:r>
+      <w:proofErr w:type="spellEnd"/>
+      <w:r>
+        <w:t xml:space="preserve"> web </w:t>
+      </w:r>
+      <w:proofErr w:type="spellStart"/>
+      <w:r>
+        <w:t>ui</w:t>
+      </w:r>
+      <w:proofErr w:type="spellEnd"/>
+      <w:r>
+        <w:t>"</w:t>
+      </w:r>
+    </w:p>
+    <w:p>
+      <w:r>
+        <w:t>git push</w:t>
+      </w:r>
+    </w:p>
     <w:p/>
     <w:p/>
     <w:sectPr>

</xml_diff>

<commit_message>
update images and metadata
</commit_message>
<xml_diff>
--- a/最新版rag套件流程.docx
+++ b/最新版rag套件流程.docx
@@ -2185,56 +2185,155 @@
         <w:t>程式</w:t>
       </w:r>
     </w:p>
-    <w:p/>
-    <w:p>
-      <w:r>
-        <w:t xml:space="preserve">python embed_to_qdrant_metadata_order_id.py --input "data/l2100_programming_metadata.json" --collection dog    </w:t>
-      </w:r>
-    </w:p>
-    <w:p/>
-    <w:p>
-      <w:r>
-        <w:rPr>
-          <w:rFonts w:hint="eastAsia"/>
-        </w:rPr>
-        <w:lastRenderedPageBreak/>
+    <w:p>
+      <w:r>
+        <w:rPr>
+          <w:rStyle w:val="11"/>
+        </w:rPr>
+        <w:t>python</w:t>
+      </w:r>
+      <w:r>
+        <w:t xml:space="preserve"> </w:t>
+      </w:r>
+      <w:r>
+        <w:rPr>
+          <w:rStyle w:val="11"/>
+        </w:rPr>
+        <w:t>pdf_to_json_programming_metadata</w:t>
+      </w:r>
+      <w:r>
+        <w:t>.</w:t>
+      </w:r>
+      <w:r>
+        <w:rPr>
+          <w:rStyle w:val="11"/>
+        </w:rPr>
+        <w:t>py</w:t>
+      </w:r>
+    </w:p>
+    <w:p>
+      <w:pPr>
+        <w:rPr>
+          <w:rStyle w:val="10"/>
+        </w:rPr>
+      </w:pPr>
+      <w:r>
+        <w:rPr>
+          <w:rFonts w:hint="eastAsia"/>
+        </w:rPr>
         <w:t>2.</w:t>
       </w:r>
       <w:r>
         <w:rPr>
-          <w:rFonts w:hint="eastAsia"/>
-        </w:rPr>
-        <w:t>抽圖</w:t>
-      </w:r>
-    </w:p>
-    <w:p>
+          <w:rStyle w:val="10"/>
+        </w:rPr>
+        <w:t xml:space="preserve"> </w:t>
+      </w:r>
+    </w:p>
+    <w:p>
+      <w:r>
+        <w:rPr>
+          <w:rStyle w:val="11"/>
+        </w:rPr>
+        <w:t>python</w:t>
+      </w:r>
+      <w:r>
+        <w:t xml:space="preserve"> </w:t>
+      </w:r>
+      <w:r>
+        <w:rPr>
+          <w:rStyle w:val="11"/>
+        </w:rPr>
+        <w:t>embed_to_qdrant_metadata_order_id</w:t>
+      </w:r>
+      <w:r>
+        <w:t>.</w:t>
+      </w:r>
+      <w:r>
+        <w:rPr>
+          <w:rStyle w:val="11"/>
+        </w:rPr>
+        <w:t>py</w:t>
+      </w:r>
+      <w:r>
+        <w:t xml:space="preserve"> </w:t>
+      </w:r>
+      <w:r>
+        <w:rPr>
+          <w:rStyle w:val="v"/>
+        </w:rPr>
+        <w:t>--</w:t>
+      </w:r>
+      <w:r>
+        <w:rPr>
+          <w:rStyle w:val="11"/>
+        </w:rPr>
+        <w:t>input</w:t>
+      </w:r>
+      <w:r>
+        <w:t xml:space="preserve"> </w:t>
+      </w:r>
+      <w:r>
+        <w:rPr>
+          <w:rStyle w:val="z"/>
+        </w:rPr>
+        <w:t>"data/l2100_programming_metadata.json"</w:t>
+      </w:r>
+      <w:r>
+        <w:t xml:space="preserve"> </w:t>
+      </w:r>
+      <w:r>
+        <w:rPr>
+          <w:rStyle w:val="v"/>
+        </w:rPr>
+        <w:t>--</w:t>
+      </w:r>
+      <w:r>
+        <w:rPr>
+          <w:rStyle w:val="11"/>
+        </w:rPr>
+        <w:t>collection</w:t>
+      </w:r>
+      <w:r>
+        <w:t xml:space="preserve"> </w:t>
+      </w:r>
+      <w:r>
+        <w:rPr>
+          <w:rStyle w:val="11"/>
+          <w:rFonts w:hint="eastAsia"/>
+        </w:rPr>
+        <w:t>d</w:t>
+      </w:r>
+      <w:r>
+        <w:rPr>
+          <w:rStyle w:val="11"/>
+        </w:rPr>
+        <w:t>og</w:t>
+      </w:r>
+    </w:p>
+    <w:p/>
+    <w:p>
+      <w:r>
+        <w:rPr>
+          <w:rFonts w:hint="eastAsia"/>
+        </w:rPr>
+        <w:t>3.</w:t>
+      </w:r>
+      <w:r>
+        <w:rPr>
+          <w:rFonts w:hint="eastAsia"/>
+        </w:rPr>
+        <w:t>重新上傳貓咪</w:t>
+      </w:r>
+    </w:p>
+    <w:p>
+      <w:pPr>
+        <w:rPr>
+          <w:rFonts w:hint="eastAsia"/>
+        </w:rPr>
+      </w:pPr>
       <w:r>
         <w:t>python extract_images.py</w:t>
-      </w:r>
-    </w:p>
-    <w:p>
-      <w:r>
-        <w:t>python pdf_to_json_programming_metadata.py</w:t>
-      </w:r>
-    </w:p>
-    <w:p>
-      <w:r>
-        <w:t>python embed_to_qdrant_metadata_order_id.py --input "data/l2100_programming_metadata.json" --collection l2100_manuals</w:t>
-      </w:r>
-    </w:p>
-    <w:p/>
-    <w:p>
-      <w:r>
-        <w:rPr>
-          <w:rFonts w:hint="eastAsia"/>
-        </w:rPr>
-        <w:t>3.</w:t>
-      </w:r>
-      <w:r>
-        <w:rPr>
-          <w:rFonts w:hint="eastAsia"/>
-        </w:rPr>
-        <w:t>重新上傳貓咪</w:t>
       </w:r>
     </w:p>
     <w:p>
@@ -3528,6 +3627,21 @@
       <w:szCs w:val="20"/>
     </w:rPr>
   </w:style>
+  <w:style w:type="character" w:customStyle="1" w:styleId="11">
+    <w:name w:val="ͼ11"/>
+    <w:basedOn w:val="a0"/>
+    <w:rsid w:val="007E482A"/>
+  </w:style>
+  <w:style w:type="character" w:customStyle="1" w:styleId="v">
+    <w:name w:val="ͼv"/>
+    <w:basedOn w:val="a0"/>
+    <w:rsid w:val="007E482A"/>
+  </w:style>
+  <w:style w:type="character" w:customStyle="1" w:styleId="z">
+    <w:name w:val="ͼz"/>
+    <w:basedOn w:val="a0"/>
+    <w:rsid w:val="007E482A"/>
+  </w:style>
 </w:styles>
 </file>
 

</xml_diff>